<commit_message>
Update SAD.docx: bo sung noi dung kien truc
</commit_message>
<xml_diff>
--- a/Docs/SAD.docx
+++ b/Docs/SAD.docx
@@ -7241,31 +7241,7 @@
           <w:color w:val="0E2841"/>
           <w:sz w:val="24"/>
         </w:rPr>
-        <w:t>Bảng 3.4.</w:t>
-      </w:r>
-      <w:r>
-        <w:rPr>
-          <w:i/>
-          <w:color w:val="0E2841"/>
-          <w:sz w:val="24"/>
-        </w:rPr>
-        <w:t>2</w:t>
-      </w:r>
-      <w:r>
-        <w:rPr>
-          <w:i/>
-          <w:color w:val="0E2841"/>
-          <w:sz w:val="24"/>
-        </w:rPr>
-        <w:t xml:space="preserve">: Bảng phân phối mức độ ưu tiên của các tác vụ </w:t>
-      </w:r>
-      <w:r>
-        <w:rPr>
-          <w:i/>
-          <w:color w:val="0E2841"/>
-          <w:sz w:val="24"/>
-        </w:rPr>
-        <w:t>Gateway Node</w:t>
+        <w:t>Bảng 3.4.2: Bảng phân phối mức độ ưu tiên của các tác vụ Gateway Node</w:t>
       </w:r>
     </w:p>
     <w:p>
@@ -8783,6 +8759,9 @@
       <w:bookmarkStart w:id="35" w:name="_Toc226255060"/>
       <w:bookmarkStart w:id="36" w:name="_Toc226255199"/>
       <w:r>
+        <w:rPr>
+          <w:noProof/>
+        </w:rPr>
         <w:lastRenderedPageBreak/>
         <w:drawing>
           <wp:inline distT="0" distB="0" distL="0" distR="0" wp14:anchorId="61D26457" wp14:editId="744F797C">
@@ -8841,39 +8820,7 @@
           <w:color w:val="0E2841"/>
           <w:sz w:val="24"/>
         </w:rPr>
-        <w:t>Hình 7.A.</w:t>
-      </w:r>
-      <w:r>
-        <w:rPr>
-          <w:i/>
-          <w:color w:val="0E2841"/>
-          <w:sz w:val="24"/>
-        </w:rPr>
-        <w:t>2</w:t>
-      </w:r>
-      <w:r>
-        <w:rPr>
-          <w:i/>
-          <w:color w:val="0E2841"/>
-          <w:sz w:val="24"/>
-        </w:rPr>
-        <w:t xml:space="preserve">: Cấu hình các chân của vi điều khiển </w:t>
-      </w:r>
-      <w:r>
-        <w:rPr>
-          <w:i/>
-          <w:color w:val="0E2841"/>
-          <w:sz w:val="24"/>
-        </w:rPr>
-        <w:t>Gateway</w:t>
-      </w:r>
-      <w:r>
-        <w:rPr>
-          <w:i/>
-          <w:color w:val="0E2841"/>
-          <w:sz w:val="24"/>
-        </w:rPr>
-        <w:t xml:space="preserve"> Node </w:t>
+        <w:t xml:space="preserve">Hình 7.A.2: Cấu hình các chân của vi điều khiển Gateway Node </w:t>
       </w:r>
     </w:p>
     <w:p>
@@ -9842,7 +9789,7 @@
           <w:p>
             <w:pPr>
               <w:spacing w:after="115" w:line="259" w:lineRule="auto"/>
-              <w:ind w:left="2" w:right="0" w:firstLine="0"/>
+              <w:ind w:left="0" w:right="0" w:firstLine="0"/>
               <w:jc w:val="left"/>
               <w:rPr>
                 <w:sz w:val="24"/>
@@ -9852,7 +9799,7 @@
               <w:rPr>
                 <w:sz w:val="24"/>
               </w:rPr>
-              <w:t>UART buffer [32] + biến BME280</w:t>
+              <w:t>FATFS &amp; SD Card buffer</w:t>
             </w:r>
           </w:p>
           <w:p>
@@ -9883,13 +9830,7 @@
               <w:rPr>
                 <w:sz w:val="24"/>
               </w:rPr>
-              <w:t>2.5KB</w:t>
-            </w:r>
-            <w:r>
-              <w:rPr>
-                <w:sz w:val="24"/>
-              </w:rPr>
-              <w:t xml:space="preserve"> </w:t>
+              <w:t xml:space="preserve">2.5KB </w:t>
             </w:r>
           </w:p>
         </w:tc>
@@ -10194,55 +10135,7 @@
           <w:color w:val="0E2841"/>
           <w:sz w:val="24"/>
         </w:rPr>
-        <w:t>Bảng 7.</w:t>
-      </w:r>
-      <w:r>
-        <w:rPr>
-          <w:i/>
-          <w:color w:val="0E2841"/>
-          <w:sz w:val="24"/>
-        </w:rPr>
-        <w:t>B</w:t>
-      </w:r>
-      <w:r>
-        <w:rPr>
-          <w:i/>
-          <w:color w:val="0E2841"/>
-          <w:sz w:val="24"/>
-        </w:rPr>
-        <w:t>.1.</w:t>
-      </w:r>
-      <w:r>
-        <w:rPr>
-          <w:i/>
-          <w:color w:val="0E2841"/>
-          <w:sz w:val="24"/>
-        </w:rPr>
-        <w:t>2</w:t>
-      </w:r>
-      <w:r>
-        <w:rPr>
-          <w:i/>
-          <w:color w:val="0E2841"/>
-          <w:sz w:val="24"/>
-        </w:rPr>
-        <w:t xml:space="preserve">: Bảng ước tính bộ nhớ RAM </w:t>
-      </w:r>
-      <w:r>
-        <w:rPr>
-          <w:i/>
-          <w:color w:val="0E2841"/>
-          <w:sz w:val="24"/>
-        </w:rPr>
-        <w:t>Gateway</w:t>
-      </w:r>
-      <w:r>
-        <w:rPr>
-          <w:i/>
-          <w:color w:val="0E2841"/>
-          <w:sz w:val="24"/>
-        </w:rPr>
-        <w:t xml:space="preserve"> Node</w:t>
+        <w:t>Bảng 7.B.1.2: Bảng ước tính bộ nhớ RAM Gateway Node</w:t>
       </w:r>
     </w:p>
     <w:p>
@@ -10390,13 +10283,7 @@
               <w:rPr>
                 <w:b/>
               </w:rPr>
-              <w:t xml:space="preserve">Dung lượng ước tính </w:t>
-            </w:r>
-            <w:r>
-              <w:rPr>
-                <w:b/>
-              </w:rPr>
-              <w:t>Gateway Node</w:t>
+              <w:t>Dung lượng ước tính Gateway Node</w:t>
             </w:r>
           </w:p>
         </w:tc>
@@ -10967,13 +10854,7 @@
               <w:rPr>
                 <w:sz w:val="24"/>
               </w:rPr>
-              <w:t>53</w:t>
-            </w:r>
-            <w:r>
-              <w:rPr>
-                <w:sz w:val="24"/>
-              </w:rPr>
-              <w:t xml:space="preserve">.0KB </w:t>
+              <w:t xml:space="preserve">53.0KB </w:t>
             </w:r>
           </w:p>
         </w:tc>

</xml_diff>